<commit_message>
chore: add .gitignore and update documents
</commit_message>
<xml_diff>
--- a/docs/AICTE Mandatory Disclosure.docx
+++ b/docs/AICTE Mandatory Disclosure.docx
@@ -224,38 +224,25 @@
         </w:rPr>
       </w:pPr>
       <w:r>
-        <w:rPr>
-          <w:rFonts w:ascii="Times New Roman" w:hAnsi="Times New Roman" w:cs="Times New Roman"/>
-          <w:sz w:val="30"/>
-          <w:szCs w:val="24"/>
-        </w:rPr>
         <w:t xml:space="preserve">Web: </w:t>
       </w:r>
-      <w:proofErr w:type="gramStart"/>
-      <w:r>
-        <w:rPr>
-          <w:rFonts w:ascii="Times New Roman" w:hAnsi="Times New Roman" w:cs="Times New Roman"/>
-          <w:sz w:val="30"/>
-          <w:szCs w:val="24"/>
-        </w:rPr>
-        <w:t>www.stmaryspanathady.com,  Email</w:t>
-      </w:r>
-      <w:proofErr w:type="gramEnd"/>
-      <w:r>
-        <w:rPr>
-          <w:rFonts w:ascii="Times New Roman" w:hAnsi="Times New Roman" w:cs="Times New Roman"/>
-          <w:sz w:val="30"/>
-          <w:szCs w:val="24"/>
-        </w:rPr>
-        <w:t xml:space="preserve">: </w:t>
-      </w:r>
-      <w:hyperlink r:id="rId6" w:history="1">
+      <w:hyperlink r:id="rId21">
         <w:r>
           <w:rPr>
-            <w:rStyle w:val="Hyperlink"/>
-            <w:rFonts w:ascii="Times New Roman" w:hAnsi="Times New Roman" w:cs="Times New Roman"/>
-            <w:sz w:val="30"/>
-            <w:szCs w:val="24"/>
+            <w:color w:val="0000EE"/>
+            <w:u w:val="single"/>
+          </w:rPr>
+          <w:t>www.stmaryspanathady.com</w:t>
+        </w:r>
+      </w:hyperlink>
+      <w:r>
+        <w:t xml:space="preserve">,  Email: </w:t>
+      </w:r>
+      <w:hyperlink r:id="rId6">
+        <w:r>
+          <w:rPr>
+            <w:color w:val="0000EE"/>
+            <w:u w:val="single"/>
           </w:rPr>
           <w:t>smcpanathady@gmail.com</w:t>
         </w:r>
@@ -1128,69 +1115,103 @@
         </w:rPr>
       </w:pPr>
       <w:r>
-        <w:rPr>
-          <w:rFonts w:ascii="Times New Roman" w:hAnsi="Times New Roman" w:cs="Times New Roman"/>
-          <w:sz w:val="30"/>
-        </w:rPr>
         <w:t xml:space="preserve">Email </w:t>
-      </w:r>
-      <w:r>
-        <w:rPr>
-          <w:rFonts w:ascii="Times New Roman" w:hAnsi="Times New Roman" w:cs="Times New Roman"/>
-          <w:sz w:val="30"/>
-        </w:rPr>
         <w:tab/>
-      </w:r>
-      <w:r>
-        <w:rPr>
-          <w:rFonts w:ascii="Times New Roman" w:hAnsi="Times New Roman" w:cs="Times New Roman"/>
-          <w:sz w:val="30"/>
-        </w:rPr>
         <w:tab/>
-      </w:r>
-      <w:r>
-        <w:rPr>
-          <w:rFonts w:ascii="Times New Roman" w:hAnsi="Times New Roman" w:cs="Times New Roman"/>
-          <w:sz w:val="30"/>
-        </w:rPr>
         <w:tab/>
-      </w:r>
-      <w:r>
-        <w:rPr>
-          <w:rFonts w:ascii="Times New Roman" w:hAnsi="Times New Roman" w:cs="Times New Roman"/>
-          <w:sz w:val="30"/>
-        </w:rPr>
         <w:tab/>
-      </w:r>
-      <w:r>
-        <w:rPr>
-          <w:rFonts w:ascii="Times New Roman" w:hAnsi="Times New Roman" w:cs="Times New Roman"/>
-          <w:sz w:val="30"/>
-        </w:rPr>
         <w:t xml:space="preserve">: </w:t>
       </w:r>
-      <w:r>
-        <w:rPr>
-          <w:rFonts w:ascii="Times New Roman" w:hAnsi="Times New Roman" w:cs="Times New Roman"/>
-          <w:sz w:val="30"/>
-        </w:rPr>
-        <w:t>smcpanathady@gmail.com</w:t>
-      </w:r>
-    </w:p>
-    <w:p>
-      <w:pPr>
-        <w:rPr>
-          <w:rFonts w:ascii="Times New Roman" w:hAnsi="Times New Roman" w:cs="Times New Roman"/>
-          <w:sz w:val="30"/>
-        </w:rPr>
-      </w:pPr>
+      <w:hyperlink r:id="rId6">
+        <w:r>
+          <w:rPr>
+            <w:color w:val="0000EE"/>
+            <w:u w:val="single"/>
+          </w:rPr>
+          <w:t>smcpanathady@gmail.com</w:t>
+        </w:r>
+      </w:hyperlink>
+    </w:p>
+    <w:p>
+      <w:pPr>
+        <w:rPr>
+          <w:rFonts w:ascii="Times New Roman" w:hAnsi="Times New Roman" w:cs="Times New Roman"/>
+          <w:sz w:val="30"/>
+        </w:rPr>
+      </w:pPr>
+      <w:r>
+        <w:t xml:space="preserve">Website : </w:t>
+      </w:r>
+      <w:hyperlink r:id="rId14">
+        <w:r>
+          <w:rPr>
+            <w:color w:val="0000EE"/>
+            <w:u w:val="single"/>
+          </w:rPr>
+          <w:t>https://stmaryspanathady.com/</w:t>
+        </w:r>
+      </w:hyperlink>
+    </w:p>
+    <w:p>
+      <w:pPr>
+        <w:rPr>
+          <w:rFonts w:ascii="Times New Roman" w:hAnsi="Times New Roman" w:cs="Times New Roman"/>
+          <w:sz w:val="30"/>
+        </w:rPr>
+      </w:pPr>
+    </w:p>
+    <w:p>
+      <w:pPr>
+        <w:rPr>
+          <w:rFonts w:ascii="Times New Roman" w:hAnsi="Times New Roman" w:cs="Times New Roman"/>
+          <w:b/>
+          <w:sz w:val="30"/>
+        </w:rPr>
+      </w:pPr>
+      <w:r>
+        <w:rPr>
+          <w:rFonts w:ascii="Times New Roman" w:hAnsi="Times New Roman" w:cs="Times New Roman"/>
+          <w:b/>
+          <w:sz w:val="30"/>
+        </w:rPr>
+        <w:t>3. Type of Institution</w:t>
+      </w:r>
+    </w:p>
+    <w:p>
+      <w:pPr>
+        <w:rPr>
+          <w:rFonts w:ascii="Times New Roman" w:hAnsi="Times New Roman" w:cs="Times New Roman"/>
+          <w:sz w:val="30"/>
+        </w:rPr>
+      </w:pPr>
+      <w:r>
+        <w:rPr>
+          <w:rFonts w:ascii="Times New Roman" w:hAnsi="Times New Roman" w:cs="Times New Roman"/>
+          <w:sz w:val="30"/>
+        </w:rPr>
+        <w:t>Type of Institution</w:t>
+      </w:r>
+      <w:r>
+        <w:rPr>
+          <w:rFonts w:ascii="Times New Roman" w:hAnsi="Times New Roman" w:cs="Times New Roman"/>
+          <w:sz w:val="30"/>
+        </w:rPr>
+        <w:tab/>
+      </w:r>
       <w:proofErr w:type="gramStart"/>
       <w:r>
         <w:rPr>
           <w:rFonts w:ascii="Times New Roman" w:hAnsi="Times New Roman" w:cs="Times New Roman"/>
           <w:sz w:val="30"/>
         </w:rPr>
-        <w:t>Website :</w:t>
+        <w:tab/>
+      </w:r>
+      <w:r>
+        <w:rPr>
+          <w:rFonts w:ascii="Times New Roman" w:hAnsi="Times New Roman" w:cs="Times New Roman"/>
+          <w:sz w:val="30"/>
+        </w:rPr>
+        <w:t xml:space="preserve"> :</w:t>
       </w:r>
       <w:proofErr w:type="gramEnd"/>
       <w:r>
@@ -1198,54 +1219,338 @@
           <w:rFonts w:ascii="Times New Roman" w:hAnsi="Times New Roman" w:cs="Times New Roman"/>
           <w:sz w:val="30"/>
         </w:rPr>
+        <w:t xml:space="preserve"> Private Self-Financed</w:t>
+      </w:r>
+    </w:p>
+    <w:p>
+      <w:pPr>
+        <w:rPr>
+          <w:rFonts w:ascii="Times New Roman" w:hAnsi="Times New Roman" w:cs="Times New Roman"/>
+          <w:sz w:val="30"/>
+        </w:rPr>
+      </w:pPr>
+      <w:r>
+        <w:rPr>
+          <w:rFonts w:ascii="Times New Roman" w:hAnsi="Times New Roman" w:cs="Times New Roman"/>
+          <w:sz w:val="30"/>
+        </w:rPr>
+        <w:t>Category (1) of the Institution</w:t>
+      </w:r>
+      <w:r>
+        <w:rPr>
+          <w:rFonts w:ascii="Times New Roman" w:hAnsi="Times New Roman" w:cs="Times New Roman"/>
+          <w:sz w:val="30"/>
+        </w:rPr>
+        <w:tab/>
+      </w:r>
+      <w:proofErr w:type="gramStart"/>
+      <w:r>
+        <w:rPr>
+          <w:rFonts w:ascii="Times New Roman" w:hAnsi="Times New Roman" w:cs="Times New Roman"/>
+          <w:sz w:val="30"/>
+        </w:rPr>
+        <w:tab/>
+      </w:r>
+      <w:r>
+        <w:rPr>
+          <w:rFonts w:ascii="Times New Roman" w:hAnsi="Times New Roman" w:cs="Times New Roman"/>
+          <w:sz w:val="30"/>
+        </w:rPr>
+        <w:t xml:space="preserve"> :</w:t>
+      </w:r>
+      <w:proofErr w:type="gramEnd"/>
+      <w:r>
+        <w:rPr>
+          <w:rFonts w:ascii="Times New Roman" w:hAnsi="Times New Roman" w:cs="Times New Roman"/>
+          <w:sz w:val="30"/>
+        </w:rPr>
+        <w:t xml:space="preserve"> Minority</w:t>
+      </w:r>
+    </w:p>
+    <w:p>
+      <w:pPr>
+        <w:rPr>
+          <w:rFonts w:ascii="Times New Roman" w:hAnsi="Times New Roman" w:cs="Times New Roman"/>
+          <w:sz w:val="30"/>
+        </w:rPr>
+      </w:pPr>
+      <w:r>
+        <w:rPr>
+          <w:rFonts w:ascii="Times New Roman" w:hAnsi="Times New Roman" w:cs="Times New Roman"/>
+          <w:sz w:val="30"/>
+        </w:rPr>
+        <w:t xml:space="preserve">Category (2) of the institution </w:t>
+      </w:r>
+      <w:r>
+        <w:rPr>
+          <w:rFonts w:ascii="Times New Roman" w:hAnsi="Times New Roman" w:cs="Times New Roman"/>
+          <w:sz w:val="30"/>
+        </w:rPr>
+        <w:tab/>
+      </w:r>
+      <w:r>
+        <w:rPr>
+          <w:rFonts w:ascii="Times New Roman" w:hAnsi="Times New Roman" w:cs="Times New Roman"/>
+          <w:sz w:val="30"/>
+        </w:rPr>
+        <w:t>: Co Ed</w:t>
+      </w:r>
+    </w:p>
+    <w:p>
+      <w:pPr>
+        <w:rPr>
+          <w:rFonts w:ascii="Times New Roman" w:hAnsi="Times New Roman" w:cs="Times New Roman"/>
+          <w:sz w:val="30"/>
+        </w:rPr>
+      </w:pPr>
+    </w:p>
+    <w:p>
+      <w:pPr>
+        <w:rPr>
+          <w:rFonts w:ascii="Times New Roman" w:hAnsi="Times New Roman" w:cs="Times New Roman"/>
+          <w:b/>
+          <w:sz w:val="30"/>
+        </w:rPr>
+      </w:pPr>
+      <w:r>
+        <w:rPr>
+          <w:rFonts w:ascii="Times New Roman" w:hAnsi="Times New Roman" w:cs="Times New Roman"/>
+          <w:b/>
+          <w:sz w:val="30"/>
+        </w:rPr>
+        <w:t>4. Name of the organization running the Institution:</w:t>
+      </w:r>
+    </w:p>
+    <w:p>
+      <w:pPr>
+        <w:rPr>
+          <w:rFonts w:ascii="Times New Roman" w:hAnsi="Times New Roman" w:cs="Times New Roman"/>
+          <w:sz w:val="30"/>
+        </w:rPr>
+      </w:pPr>
+    </w:p>
+    <w:p>
+      <w:pPr>
+        <w:rPr>
+          <w:rFonts w:ascii="Times New Roman" w:hAnsi="Times New Roman" w:cs="Times New Roman"/>
+          <w:sz w:val="30"/>
+        </w:rPr>
+      </w:pPr>
+      <w:r>
+        <w:rPr>
+          <w:rFonts w:ascii="Times New Roman" w:hAnsi="Times New Roman" w:cs="Times New Roman"/>
+          <w:sz w:val="30"/>
+        </w:rPr>
+        <w:t>Name of the organization running</w:t>
+      </w:r>
+      <w:proofErr w:type="gramStart"/>
+      <w:r>
+        <w:rPr>
+          <w:rFonts w:ascii="Times New Roman" w:hAnsi="Times New Roman" w:cs="Times New Roman"/>
+          <w:sz w:val="30"/>
+        </w:rPr>
+        <w:tab/>
+      </w:r>
+      <w:r>
+        <w:rPr>
+          <w:rFonts w:ascii="Times New Roman" w:hAnsi="Times New Roman" w:cs="Times New Roman"/>
+          <w:sz w:val="30"/>
+        </w:rPr>
+        <w:t xml:space="preserve"> :</w:t>
+      </w:r>
+      <w:proofErr w:type="gramEnd"/>
+      <w:r>
+        <w:rPr>
+          <w:rFonts w:ascii="Times New Roman" w:hAnsi="Times New Roman" w:cs="Times New Roman"/>
+          <w:sz w:val="30"/>
+        </w:rPr>
+        <w:t xml:space="preserve"> SONS of the Immaculate</w:t>
+      </w:r>
+    </w:p>
+    <w:p>
+      <w:pPr>
+        <w:ind w:left="3600"/>
+        <w:rPr>
+          <w:rFonts w:ascii="Times New Roman" w:hAnsi="Times New Roman" w:cs="Times New Roman"/>
+          <w:sz w:val="30"/>
+        </w:rPr>
+      </w:pPr>
+      <w:r>
+        <w:rPr>
+          <w:rFonts w:ascii="Times New Roman" w:hAnsi="Times New Roman" w:cs="Times New Roman"/>
+          <w:sz w:val="30"/>
+        </w:rPr>
+        <w:t>Conception the Institutio</w:t>
+      </w:r>
+      <w:r>
+        <w:rPr>
+          <w:rFonts w:ascii="Times New Roman" w:hAnsi="Times New Roman" w:cs="Times New Roman"/>
+          <w:sz w:val="30"/>
+        </w:rPr>
+        <w:t xml:space="preserve">n </w:t>
+      </w:r>
+      <w:r>
+        <w:rPr>
+          <w:rFonts w:ascii="Times New Roman" w:hAnsi="Times New Roman" w:cs="Times New Roman"/>
+          <w:sz w:val="30"/>
+        </w:rPr>
+        <w:t>of India (CFIC)</w:t>
+      </w:r>
+    </w:p>
+    <w:p>
+      <w:pPr>
+        <w:rPr>
+          <w:rFonts w:ascii="Times New Roman" w:hAnsi="Times New Roman" w:cs="Times New Roman"/>
+          <w:sz w:val="30"/>
+        </w:rPr>
+      </w:pPr>
+      <w:r>
+        <w:rPr>
+          <w:rFonts w:ascii="Times New Roman" w:hAnsi="Times New Roman" w:cs="Times New Roman"/>
+          <w:sz w:val="30"/>
+        </w:rPr>
+        <w:t>Address of the organization</w:t>
+      </w:r>
+      <w:r>
+        <w:rPr>
+          <w:rFonts w:ascii="Times New Roman" w:hAnsi="Times New Roman" w:cs="Times New Roman"/>
+          <w:sz w:val="30"/>
+        </w:rPr>
+        <w:tab/>
+      </w:r>
+      <w:proofErr w:type="gramStart"/>
+      <w:r>
+        <w:rPr>
+          <w:rFonts w:ascii="Times New Roman" w:hAnsi="Times New Roman" w:cs="Times New Roman"/>
+          <w:sz w:val="30"/>
+        </w:rPr>
+        <w:tab/>
+      </w:r>
+      <w:r>
+        <w:rPr>
+          <w:rFonts w:ascii="Times New Roman" w:hAnsi="Times New Roman" w:cs="Times New Roman"/>
+          <w:sz w:val="30"/>
+        </w:rPr>
+        <w:t xml:space="preserve"> :</w:t>
+      </w:r>
+      <w:proofErr w:type="gramEnd"/>
+      <w:r>
+        <w:rPr>
+          <w:rFonts w:ascii="Times New Roman" w:hAnsi="Times New Roman" w:cs="Times New Roman"/>
+          <w:sz w:val="30"/>
+        </w:rPr>
+        <w:t xml:space="preserve"> SONS of the Immaculate</w:t>
+      </w:r>
+    </w:p>
+    <w:p>
+      <w:pPr>
+        <w:ind w:left="3600" w:firstLine="720"/>
+        <w:rPr>
+          <w:rFonts w:ascii="Times New Roman" w:hAnsi="Times New Roman" w:cs="Times New Roman"/>
+          <w:sz w:val="30"/>
+        </w:rPr>
+      </w:pPr>
+      <w:r>
+        <w:rPr>
+          <w:rFonts w:ascii="Times New Roman" w:hAnsi="Times New Roman" w:cs="Times New Roman"/>
+          <w:sz w:val="30"/>
+        </w:rPr>
+        <w:t>Conception of India (CFIC),</w:t>
+      </w:r>
+    </w:p>
+    <w:p>
+      <w:pPr>
+        <w:ind w:left="3600" w:firstLine="720"/>
+        <w:rPr>
+          <w:rFonts w:ascii="Times New Roman" w:hAnsi="Times New Roman" w:cs="Times New Roman"/>
+          <w:sz w:val="30"/>
+        </w:rPr>
+      </w:pPr>
+      <w:proofErr w:type="spellStart"/>
+      <w:r>
+        <w:rPr>
+          <w:rFonts w:ascii="Times New Roman" w:hAnsi="Times New Roman" w:cs="Times New Roman"/>
+          <w:sz w:val="30"/>
+        </w:rPr>
+        <w:t>Orest</w:t>
+      </w:r>
+      <w:proofErr w:type="spellEnd"/>
+      <w:r>
+        <w:rPr>
+          <w:rFonts w:ascii="Times New Roman" w:hAnsi="Times New Roman" w:cs="Times New Roman"/>
+          <w:sz w:val="30"/>
+        </w:rPr>
+        <w:t xml:space="preserve"> Bhavan, </w:t>
+      </w:r>
+      <w:proofErr w:type="spellStart"/>
+      <w:r>
+        <w:rPr>
+          <w:rFonts w:ascii="Times New Roman" w:hAnsi="Times New Roman" w:cs="Times New Roman"/>
+          <w:sz w:val="30"/>
+        </w:rPr>
+        <w:t>Muttambalam</w:t>
+      </w:r>
+      <w:proofErr w:type="spellEnd"/>
+      <w:r>
+        <w:rPr>
+          <w:rFonts w:ascii="Times New Roman" w:hAnsi="Times New Roman" w:cs="Times New Roman"/>
+          <w:sz w:val="30"/>
+        </w:rPr>
+        <w:t>,</w:t>
+      </w:r>
+    </w:p>
+    <w:p>
+      <w:pPr>
+        <w:ind w:left="3600" w:firstLine="720"/>
+        <w:rPr>
+          <w:rFonts w:ascii="Times New Roman" w:hAnsi="Times New Roman" w:cs="Times New Roman"/>
+          <w:sz w:val="30"/>
+        </w:rPr>
+      </w:pPr>
+      <w:r>
+        <w:rPr>
+          <w:rFonts w:ascii="Times New Roman" w:hAnsi="Times New Roman" w:cs="Times New Roman"/>
+          <w:sz w:val="30"/>
+        </w:rPr>
+        <w:t>Kottayam 686004</w:t>
+      </w:r>
+    </w:p>
+    <w:p>
+      <w:pPr>
+        <w:ind w:left="3600" w:firstLine="720"/>
+        <w:rPr>
+          <w:rFonts w:ascii="Times New Roman" w:hAnsi="Times New Roman" w:cs="Times New Roman"/>
+          <w:sz w:val="30"/>
+        </w:rPr>
+      </w:pPr>
+      <w:r>
+        <w:rPr>
+          <w:rFonts w:ascii="Times New Roman" w:hAnsi="Times New Roman" w:cs="Times New Roman"/>
+          <w:sz w:val="30"/>
+        </w:rPr>
+        <w:t>680 308</w:t>
+      </w:r>
+      <w:r>
+        <w:rPr>
+          <w:rFonts w:ascii="Times New Roman" w:hAnsi="Times New Roman" w:cs="Times New Roman"/>
+          <w:sz w:val="30"/>
+        </w:rPr>
         <w:t xml:space="preserve"> </w:t>
       </w:r>
-      <w:r>
-        <w:rPr>
-          <w:rFonts w:ascii="Times New Roman" w:hAnsi="Times New Roman" w:cs="Times New Roman"/>
-          <w:sz w:val="30"/>
-        </w:rPr>
-        <w:t>https://subran.github.io/stmaryspanathady/</w:t>
-      </w:r>
-    </w:p>
-    <w:p>
-      <w:pPr>
-        <w:rPr>
-          <w:rFonts w:ascii="Times New Roman" w:hAnsi="Times New Roman" w:cs="Times New Roman"/>
-          <w:sz w:val="30"/>
-        </w:rPr>
-      </w:pPr>
-    </w:p>
-    <w:p>
-      <w:pPr>
-        <w:rPr>
-          <w:rFonts w:ascii="Times New Roman" w:hAnsi="Times New Roman" w:cs="Times New Roman"/>
-          <w:b/>
-          <w:sz w:val="30"/>
-        </w:rPr>
-      </w:pPr>
-      <w:r>
-        <w:rPr>
-          <w:rFonts w:ascii="Times New Roman" w:hAnsi="Times New Roman" w:cs="Times New Roman"/>
-          <w:b/>
-          <w:sz w:val="30"/>
-        </w:rPr>
-        <w:t>3. Type of Institution</w:t>
-      </w:r>
-    </w:p>
-    <w:p>
-      <w:pPr>
-        <w:rPr>
-          <w:rFonts w:ascii="Times New Roman" w:hAnsi="Times New Roman" w:cs="Times New Roman"/>
-          <w:sz w:val="30"/>
-        </w:rPr>
-      </w:pPr>
-      <w:r>
-        <w:rPr>
-          <w:rFonts w:ascii="Times New Roman" w:hAnsi="Times New Roman" w:cs="Times New Roman"/>
-          <w:sz w:val="30"/>
-        </w:rPr>
-        <w:t>Type of Institution</w:t>
+    </w:p>
+    <w:p>
+      <w:pPr>
+        <w:rPr>
+          <w:rFonts w:ascii="Times New Roman" w:hAnsi="Times New Roman" w:cs="Times New Roman"/>
+          <w:sz w:val="30"/>
+        </w:rPr>
+      </w:pPr>
+      <w:r>
+        <w:rPr>
+          <w:rFonts w:ascii="Times New Roman" w:hAnsi="Times New Roman" w:cs="Times New Roman"/>
+          <w:sz w:val="30"/>
+        </w:rPr>
+        <w:t>Registered with</w:t>
       </w:r>
       <w:r>
         <w:rPr>
@@ -1254,6 +1559,20 @@
         </w:rPr>
         <w:tab/>
       </w:r>
+      <w:r>
+        <w:rPr>
+          <w:rFonts w:ascii="Times New Roman" w:hAnsi="Times New Roman" w:cs="Times New Roman"/>
+          <w:sz w:val="30"/>
+        </w:rPr>
+        <w:tab/>
+      </w:r>
+      <w:r>
+        <w:rPr>
+          <w:rFonts w:ascii="Times New Roman" w:hAnsi="Times New Roman" w:cs="Times New Roman"/>
+          <w:sz w:val="30"/>
+        </w:rPr>
+        <w:tab/>
+      </w:r>
       <w:proofErr w:type="gramStart"/>
       <w:r>
         <w:rPr>
@@ -1275,22 +1594,22 @@
           <w:rFonts w:ascii="Times New Roman" w:hAnsi="Times New Roman" w:cs="Times New Roman"/>
           <w:sz w:val="30"/>
         </w:rPr>
-        <w:t xml:space="preserve"> Private Self-Financed</w:t>
-      </w:r>
-    </w:p>
-    <w:p>
-      <w:pPr>
-        <w:rPr>
-          <w:rFonts w:ascii="Times New Roman" w:hAnsi="Times New Roman" w:cs="Times New Roman"/>
-          <w:sz w:val="30"/>
-        </w:rPr>
-      </w:pPr>
-      <w:r>
-        <w:rPr>
-          <w:rFonts w:ascii="Times New Roman" w:hAnsi="Times New Roman" w:cs="Times New Roman"/>
-          <w:sz w:val="30"/>
-        </w:rPr>
-        <w:t>Category (1) of the Institution</w:t>
+        <w:t xml:space="preserve"> Registrar of Societies</w:t>
+      </w:r>
+    </w:p>
+    <w:p>
+      <w:pPr>
+        <w:rPr>
+          <w:rFonts w:ascii="Times New Roman" w:hAnsi="Times New Roman" w:cs="Times New Roman"/>
+          <w:sz w:val="30"/>
+        </w:rPr>
+      </w:pPr>
+      <w:r>
+        <w:rPr>
+          <w:rFonts w:ascii="Times New Roman" w:hAnsi="Times New Roman" w:cs="Times New Roman"/>
+          <w:sz w:val="30"/>
+        </w:rPr>
+        <w:t>Registration No &amp; Date</w:t>
       </w:r>
       <w:r>
         <w:rPr>
@@ -1299,6 +1618,13 @@
         </w:rPr>
         <w:tab/>
       </w:r>
+      <w:r>
+        <w:rPr>
+          <w:rFonts w:ascii="Times New Roman" w:hAnsi="Times New Roman" w:cs="Times New Roman"/>
+          <w:sz w:val="30"/>
+        </w:rPr>
+        <w:tab/>
+      </w:r>
       <w:proofErr w:type="gramStart"/>
       <w:r>
         <w:rPr>
@@ -1320,435 +1646,31 @@
           <w:rFonts w:ascii="Times New Roman" w:hAnsi="Times New Roman" w:cs="Times New Roman"/>
           <w:sz w:val="30"/>
         </w:rPr>
-        <w:t xml:space="preserve"> Minority</w:t>
-      </w:r>
-    </w:p>
-    <w:p>
-      <w:pPr>
-        <w:rPr>
-          <w:rFonts w:ascii="Times New Roman" w:hAnsi="Times New Roman" w:cs="Times New Roman"/>
-          <w:sz w:val="30"/>
-        </w:rPr>
-      </w:pPr>
-      <w:r>
-        <w:rPr>
-          <w:rFonts w:ascii="Times New Roman" w:hAnsi="Times New Roman" w:cs="Times New Roman"/>
-          <w:sz w:val="30"/>
-        </w:rPr>
-        <w:t xml:space="preserve">Category (2) of the institution </w:t>
-      </w:r>
-      <w:r>
-        <w:rPr>
-          <w:rFonts w:ascii="Times New Roman" w:hAnsi="Times New Roman" w:cs="Times New Roman"/>
-          <w:sz w:val="30"/>
-        </w:rPr>
+        <w:t xml:space="preserve"> K 176/87, 13/05/1987</w:t>
+      </w:r>
+    </w:p>
+    <w:p>
+      <w:pPr>
+        <w:rPr>
+          <w:rFonts w:ascii="Times New Roman" w:hAnsi="Times New Roman" w:cs="Times New Roman"/>
+          <w:sz w:val="30"/>
+        </w:rPr>
+      </w:pPr>
+      <w:r>
+        <w:t>Website of the Organization</w:t>
         <w:tab/>
-      </w:r>
-      <w:r>
-        <w:rPr>
-          <w:rFonts w:ascii="Times New Roman" w:hAnsi="Times New Roman" w:cs="Times New Roman"/>
-          <w:sz w:val="30"/>
-        </w:rPr>
-        <w:t>: Co Ed</w:t>
-      </w:r>
-    </w:p>
-    <w:p>
-      <w:pPr>
-        <w:rPr>
-          <w:rFonts w:ascii="Times New Roman" w:hAnsi="Times New Roman" w:cs="Times New Roman"/>
-          <w:sz w:val="30"/>
-        </w:rPr>
-      </w:pPr>
-    </w:p>
-    <w:p>
-      <w:pPr>
-        <w:rPr>
-          <w:rFonts w:ascii="Times New Roman" w:hAnsi="Times New Roman" w:cs="Times New Roman"/>
-          <w:b/>
-          <w:sz w:val="30"/>
-        </w:rPr>
-      </w:pPr>
-      <w:r>
-        <w:rPr>
-          <w:rFonts w:ascii="Times New Roman" w:hAnsi="Times New Roman" w:cs="Times New Roman"/>
-          <w:b/>
-          <w:sz w:val="30"/>
-        </w:rPr>
-        <w:t>4. Name of the organization running the Institution:</w:t>
-      </w:r>
-    </w:p>
-    <w:p>
-      <w:pPr>
-        <w:rPr>
-          <w:rFonts w:ascii="Times New Roman" w:hAnsi="Times New Roman" w:cs="Times New Roman"/>
-          <w:sz w:val="30"/>
-        </w:rPr>
-      </w:pPr>
-    </w:p>
-    <w:p>
-      <w:pPr>
-        <w:rPr>
-          <w:rFonts w:ascii="Times New Roman" w:hAnsi="Times New Roman" w:cs="Times New Roman"/>
-          <w:sz w:val="30"/>
-        </w:rPr>
-      </w:pPr>
-      <w:r>
-        <w:rPr>
-          <w:rFonts w:ascii="Times New Roman" w:hAnsi="Times New Roman" w:cs="Times New Roman"/>
-          <w:sz w:val="30"/>
-        </w:rPr>
-        <w:t>Name of the organization running</w:t>
-      </w:r>
-      <w:proofErr w:type="gramStart"/>
-      <w:r>
-        <w:rPr>
-          <w:rFonts w:ascii="Times New Roman" w:hAnsi="Times New Roman" w:cs="Times New Roman"/>
-          <w:sz w:val="30"/>
-        </w:rPr>
         <w:tab/>
-      </w:r>
-      <w:r>
-        <w:rPr>
-          <w:rFonts w:ascii="Times New Roman" w:hAnsi="Times New Roman" w:cs="Times New Roman"/>
-          <w:sz w:val="30"/>
-        </w:rPr>
-        <w:t xml:space="preserve"> :</w:t>
-      </w:r>
-      <w:proofErr w:type="gramEnd"/>
-      <w:r>
-        <w:rPr>
-          <w:rFonts w:ascii="Times New Roman" w:hAnsi="Times New Roman" w:cs="Times New Roman"/>
-          <w:sz w:val="30"/>
-        </w:rPr>
-        <w:t xml:space="preserve"> SONS of the Immaculate</w:t>
-      </w:r>
-    </w:p>
-    <w:p>
-      <w:pPr>
-        <w:ind w:left="3600"/>
-        <w:rPr>
-          <w:rFonts w:ascii="Times New Roman" w:hAnsi="Times New Roman" w:cs="Times New Roman"/>
-          <w:sz w:val="30"/>
-        </w:rPr>
-      </w:pPr>
-      <w:r>
-        <w:rPr>
-          <w:rFonts w:ascii="Times New Roman" w:hAnsi="Times New Roman" w:cs="Times New Roman"/>
-          <w:sz w:val="30"/>
-        </w:rPr>
-        <w:t>Conception the Institutio</w:t>
-      </w:r>
-      <w:r>
-        <w:rPr>
-          <w:rFonts w:ascii="Times New Roman" w:hAnsi="Times New Roman" w:cs="Times New Roman"/>
-          <w:sz w:val="30"/>
-        </w:rPr>
-        <w:t xml:space="preserve">n </w:t>
-      </w:r>
-      <w:r>
-        <w:rPr>
-          <w:rFonts w:ascii="Times New Roman" w:hAnsi="Times New Roman" w:cs="Times New Roman"/>
-          <w:sz w:val="30"/>
-        </w:rPr>
-        <w:t>of India (CFIC)</w:t>
-      </w:r>
-    </w:p>
-    <w:p>
-      <w:pPr>
-        <w:rPr>
-          <w:rFonts w:ascii="Times New Roman" w:hAnsi="Times New Roman" w:cs="Times New Roman"/>
-          <w:sz w:val="30"/>
-        </w:rPr>
-      </w:pPr>
-      <w:r>
-        <w:rPr>
-          <w:rFonts w:ascii="Times New Roman" w:hAnsi="Times New Roman" w:cs="Times New Roman"/>
-          <w:sz w:val="30"/>
-        </w:rPr>
-        <w:t>Address of the organization</w:t>
-      </w:r>
-      <w:r>
-        <w:rPr>
-          <w:rFonts w:ascii="Times New Roman" w:hAnsi="Times New Roman" w:cs="Times New Roman"/>
-          <w:sz w:val="30"/>
-        </w:rPr>
-        <w:tab/>
-      </w:r>
-      <w:proofErr w:type="gramStart"/>
-      <w:r>
-        <w:rPr>
-          <w:rFonts w:ascii="Times New Roman" w:hAnsi="Times New Roman" w:cs="Times New Roman"/>
-          <w:sz w:val="30"/>
-        </w:rPr>
-        <w:tab/>
-      </w:r>
-      <w:r>
-        <w:rPr>
-          <w:rFonts w:ascii="Times New Roman" w:hAnsi="Times New Roman" w:cs="Times New Roman"/>
-          <w:sz w:val="30"/>
-        </w:rPr>
-        <w:t xml:space="preserve"> :</w:t>
-      </w:r>
-      <w:proofErr w:type="gramEnd"/>
-      <w:r>
-        <w:rPr>
-          <w:rFonts w:ascii="Times New Roman" w:hAnsi="Times New Roman" w:cs="Times New Roman"/>
-          <w:sz w:val="30"/>
-        </w:rPr>
-        <w:t xml:space="preserve"> SONS of the Immaculate</w:t>
-      </w:r>
-    </w:p>
-    <w:p>
-      <w:pPr>
-        <w:ind w:left="3600" w:firstLine="720"/>
-        <w:rPr>
-          <w:rFonts w:ascii="Times New Roman" w:hAnsi="Times New Roman" w:cs="Times New Roman"/>
-          <w:sz w:val="30"/>
-        </w:rPr>
-      </w:pPr>
-      <w:r>
-        <w:rPr>
-          <w:rFonts w:ascii="Times New Roman" w:hAnsi="Times New Roman" w:cs="Times New Roman"/>
-          <w:sz w:val="30"/>
-        </w:rPr>
-        <w:t>Conception of India (CFIC),</w:t>
-      </w:r>
-    </w:p>
-    <w:p>
-      <w:pPr>
-        <w:ind w:left="3600" w:firstLine="720"/>
-        <w:rPr>
-          <w:rFonts w:ascii="Times New Roman" w:hAnsi="Times New Roman" w:cs="Times New Roman"/>
-          <w:sz w:val="30"/>
-        </w:rPr>
-      </w:pPr>
-      <w:proofErr w:type="spellStart"/>
-      <w:r>
-        <w:rPr>
-          <w:rFonts w:ascii="Times New Roman" w:hAnsi="Times New Roman" w:cs="Times New Roman"/>
-          <w:sz w:val="30"/>
-        </w:rPr>
-        <w:t>Orest</w:t>
-      </w:r>
-      <w:proofErr w:type="spellEnd"/>
-      <w:r>
-        <w:rPr>
-          <w:rFonts w:ascii="Times New Roman" w:hAnsi="Times New Roman" w:cs="Times New Roman"/>
-          <w:sz w:val="30"/>
-        </w:rPr>
-        <w:t xml:space="preserve"> Bhavan, </w:t>
-      </w:r>
-      <w:proofErr w:type="spellStart"/>
-      <w:r>
-        <w:rPr>
-          <w:rFonts w:ascii="Times New Roman" w:hAnsi="Times New Roman" w:cs="Times New Roman"/>
-          <w:sz w:val="30"/>
-        </w:rPr>
-        <w:t>Muttambalam</w:t>
-      </w:r>
-      <w:proofErr w:type="spellEnd"/>
-      <w:r>
-        <w:rPr>
-          <w:rFonts w:ascii="Times New Roman" w:hAnsi="Times New Roman" w:cs="Times New Roman"/>
-          <w:sz w:val="30"/>
-        </w:rPr>
-        <w:t>,</w:t>
-      </w:r>
-    </w:p>
-    <w:p>
-      <w:pPr>
-        <w:ind w:left="3600" w:firstLine="720"/>
-        <w:rPr>
-          <w:rFonts w:ascii="Times New Roman" w:hAnsi="Times New Roman" w:cs="Times New Roman"/>
-          <w:sz w:val="30"/>
-        </w:rPr>
-      </w:pPr>
-      <w:r>
-        <w:rPr>
-          <w:rFonts w:ascii="Times New Roman" w:hAnsi="Times New Roman" w:cs="Times New Roman"/>
-          <w:sz w:val="30"/>
-        </w:rPr>
-        <w:t>Kottayam 686004</w:t>
-      </w:r>
-    </w:p>
-    <w:p>
-      <w:pPr>
-        <w:ind w:left="3600" w:firstLine="720"/>
-        <w:rPr>
-          <w:rFonts w:ascii="Times New Roman" w:hAnsi="Times New Roman" w:cs="Times New Roman"/>
-          <w:sz w:val="30"/>
-        </w:rPr>
-      </w:pPr>
-      <w:r>
-        <w:rPr>
-          <w:rFonts w:ascii="Times New Roman" w:hAnsi="Times New Roman" w:cs="Times New Roman"/>
-          <w:sz w:val="30"/>
-        </w:rPr>
-        <w:t>680 308</w:t>
-      </w:r>
-      <w:r>
-        <w:rPr>
-          <w:rFonts w:ascii="Times New Roman" w:hAnsi="Times New Roman" w:cs="Times New Roman"/>
-          <w:sz w:val="30"/>
-        </w:rPr>
-        <w:t xml:space="preserve"> </w:t>
-      </w:r>
-    </w:p>
-    <w:p>
-      <w:pPr>
-        <w:rPr>
-          <w:rFonts w:ascii="Times New Roman" w:hAnsi="Times New Roman" w:cs="Times New Roman"/>
-          <w:sz w:val="30"/>
-        </w:rPr>
-      </w:pPr>
-      <w:r>
-        <w:rPr>
-          <w:rFonts w:ascii="Times New Roman" w:hAnsi="Times New Roman" w:cs="Times New Roman"/>
-          <w:sz w:val="30"/>
-        </w:rPr>
-        <w:t>Registered with</w:t>
-      </w:r>
-      <w:r>
-        <w:rPr>
-          <w:rFonts w:ascii="Times New Roman" w:hAnsi="Times New Roman" w:cs="Times New Roman"/>
-          <w:sz w:val="30"/>
-        </w:rPr>
-        <w:tab/>
-      </w:r>
-      <w:r>
-        <w:rPr>
-          <w:rFonts w:ascii="Times New Roman" w:hAnsi="Times New Roman" w:cs="Times New Roman"/>
-          <w:sz w:val="30"/>
-        </w:rPr>
-        <w:tab/>
-      </w:r>
-      <w:r>
-        <w:rPr>
-          <w:rFonts w:ascii="Times New Roman" w:hAnsi="Times New Roman" w:cs="Times New Roman"/>
-          <w:sz w:val="30"/>
-        </w:rPr>
-        <w:tab/>
-      </w:r>
-      <w:proofErr w:type="gramStart"/>
-      <w:r>
-        <w:rPr>
-          <w:rFonts w:ascii="Times New Roman" w:hAnsi="Times New Roman" w:cs="Times New Roman"/>
-          <w:sz w:val="30"/>
-        </w:rPr>
-        <w:tab/>
-      </w:r>
-      <w:r>
-        <w:rPr>
-          <w:rFonts w:ascii="Times New Roman" w:hAnsi="Times New Roman" w:cs="Times New Roman"/>
-          <w:sz w:val="30"/>
-        </w:rPr>
-        <w:t xml:space="preserve"> :</w:t>
-      </w:r>
-      <w:proofErr w:type="gramEnd"/>
-      <w:r>
-        <w:rPr>
-          <w:rFonts w:ascii="Times New Roman" w:hAnsi="Times New Roman" w:cs="Times New Roman"/>
-          <w:sz w:val="30"/>
-        </w:rPr>
-        <w:t xml:space="preserve"> Registrar of Societies</w:t>
-      </w:r>
-    </w:p>
-    <w:p>
-      <w:pPr>
-        <w:rPr>
-          <w:rFonts w:ascii="Times New Roman" w:hAnsi="Times New Roman" w:cs="Times New Roman"/>
-          <w:sz w:val="30"/>
-        </w:rPr>
-      </w:pPr>
-      <w:r>
-        <w:rPr>
-          <w:rFonts w:ascii="Times New Roman" w:hAnsi="Times New Roman" w:cs="Times New Roman"/>
-          <w:sz w:val="30"/>
-        </w:rPr>
-        <w:t>Registration No &amp; Date</w:t>
-      </w:r>
-      <w:r>
-        <w:rPr>
-          <w:rFonts w:ascii="Times New Roman" w:hAnsi="Times New Roman" w:cs="Times New Roman"/>
-          <w:sz w:val="30"/>
-        </w:rPr>
-        <w:tab/>
-      </w:r>
-      <w:r>
-        <w:rPr>
-          <w:rFonts w:ascii="Times New Roman" w:hAnsi="Times New Roman" w:cs="Times New Roman"/>
-          <w:sz w:val="30"/>
-        </w:rPr>
-        <w:tab/>
-      </w:r>
-      <w:proofErr w:type="gramStart"/>
-      <w:r>
-        <w:rPr>
-          <w:rFonts w:ascii="Times New Roman" w:hAnsi="Times New Roman" w:cs="Times New Roman"/>
-          <w:sz w:val="30"/>
-        </w:rPr>
-        <w:tab/>
-      </w:r>
-      <w:r>
-        <w:rPr>
-          <w:rFonts w:ascii="Times New Roman" w:hAnsi="Times New Roman" w:cs="Times New Roman"/>
-          <w:sz w:val="30"/>
-        </w:rPr>
-        <w:t xml:space="preserve"> :</w:t>
-      </w:r>
-      <w:proofErr w:type="gramEnd"/>
-      <w:r>
-        <w:rPr>
-          <w:rFonts w:ascii="Times New Roman" w:hAnsi="Times New Roman" w:cs="Times New Roman"/>
-          <w:sz w:val="30"/>
-        </w:rPr>
-        <w:t xml:space="preserve"> K 176/87, 13/05/1987</w:t>
-      </w:r>
-    </w:p>
-    <w:p>
-      <w:pPr>
-        <w:rPr>
-          <w:rFonts w:ascii="Times New Roman" w:hAnsi="Times New Roman" w:cs="Times New Roman"/>
-          <w:sz w:val="30"/>
-        </w:rPr>
-      </w:pPr>
-      <w:r>
-        <w:rPr>
-          <w:rFonts w:ascii="Times New Roman" w:hAnsi="Times New Roman" w:cs="Times New Roman"/>
-          <w:sz w:val="30"/>
-        </w:rPr>
-        <w:t>Website of the Organization</w:t>
-      </w:r>
-      <w:r>
-        <w:rPr>
-          <w:rFonts w:ascii="Times New Roman" w:hAnsi="Times New Roman" w:cs="Times New Roman"/>
-          <w:sz w:val="30"/>
-        </w:rPr>
-        <w:tab/>
-      </w:r>
-      <w:proofErr w:type="gramStart"/>
-      <w:r>
-        <w:rPr>
-          <w:rFonts w:ascii="Times New Roman" w:hAnsi="Times New Roman" w:cs="Times New Roman"/>
-          <w:sz w:val="30"/>
-        </w:rPr>
-        <w:tab/>
-      </w:r>
-      <w:r>
-        <w:rPr>
-          <w:rFonts w:ascii="Times New Roman" w:hAnsi="Times New Roman" w:cs="Times New Roman"/>
-          <w:sz w:val="30"/>
-        </w:rPr>
-        <w:t xml:space="preserve"> :</w:t>
-      </w:r>
-      <w:proofErr w:type="gramEnd"/>
-      <w:r>
-        <w:rPr>
-          <w:rFonts w:ascii="Times New Roman" w:hAnsi="Times New Roman" w:cs="Times New Roman"/>
-          <w:sz w:val="30"/>
-        </w:rPr>
-        <w:t xml:space="preserve"> http://cficindia.org</w:t>
-      </w:r>
+        <w:t xml:space="preserve"> : </w:t>
+      </w:r>
+      <w:hyperlink r:id="rId22">
+        <w:r>
+          <w:rPr>
+            <w:color w:val="0000EE"/>
+            <w:u w:val="single"/>
+          </w:rPr>
+          <w:t>http://cficindia.org</w:t>
+        </w:r>
+      </w:hyperlink>
     </w:p>
     <w:p>
       <w:pPr>
@@ -2038,22 +1960,18 @@
           <w:sz w:val="30"/>
         </w:rPr>
       </w:pPr>
-      <w:proofErr w:type="gramStart"/>
-      <w:r>
-        <w:rPr>
-          <w:rFonts w:ascii="Times New Roman" w:hAnsi="Times New Roman" w:cs="Times New Roman"/>
-          <w:sz w:val="30"/>
-        </w:rPr>
-        <w:t>Website :</w:t>
-      </w:r>
-      <w:proofErr w:type="gramEnd"/>
-      <w:r>
-        <w:rPr>
-          <w:rFonts w:ascii="Times New Roman" w:hAnsi="Times New Roman" w:cs="Times New Roman"/>
-          <w:sz w:val="30"/>
-        </w:rPr>
-        <w:t xml:space="preserve"> https://uoc.ac.in/</w:t>
-      </w:r>
+      <w:r>
+        <w:t xml:space="preserve">Website : </w:t>
+      </w:r>
+      <w:hyperlink r:id="rId23">
+        <w:r>
+          <w:rPr>
+            <w:color w:val="0000EE"/>
+            <w:u w:val="single"/>
+          </w:rPr>
+          <w:t>https://uoc.ac.in/</w:t>
+        </w:r>
+      </w:hyperlink>
     </w:p>
     <w:p>
       <w:pPr>
@@ -2325,84 +2243,25 @@
         </w:rPr>
       </w:pPr>
       <w:r>
-        <w:rPr>
-          <w:rFonts w:ascii="Times New Roman" w:hAnsi="Times New Roman" w:cs="Times New Roman"/>
-          <w:sz w:val="30"/>
-        </w:rPr>
         <w:t>Email</w:t>
-      </w:r>
-      <w:r>
-        <w:rPr>
-          <w:rFonts w:ascii="Times New Roman" w:hAnsi="Times New Roman" w:cs="Times New Roman"/>
-          <w:sz w:val="30"/>
-        </w:rPr>
         <w:tab/>
-      </w:r>
-      <w:r>
-        <w:rPr>
-          <w:rFonts w:ascii="Times New Roman" w:hAnsi="Times New Roman" w:cs="Times New Roman"/>
-          <w:sz w:val="30"/>
-        </w:rPr>
         <w:tab/>
-      </w:r>
-      <w:r>
-        <w:rPr>
-          <w:rFonts w:ascii="Times New Roman" w:hAnsi="Times New Roman" w:cs="Times New Roman"/>
-          <w:sz w:val="30"/>
-        </w:rPr>
         <w:tab/>
-      </w:r>
-      <w:r>
-        <w:rPr>
-          <w:rFonts w:ascii="Times New Roman" w:hAnsi="Times New Roman" w:cs="Times New Roman"/>
-          <w:sz w:val="30"/>
-        </w:rPr>
         <w:tab/>
-      </w:r>
-      <w:r>
-        <w:rPr>
-          <w:rFonts w:ascii="Times New Roman" w:hAnsi="Times New Roman" w:cs="Times New Roman"/>
-          <w:sz w:val="30"/>
-        </w:rPr>
         <w:tab/>
-      </w:r>
-      <w:r>
-        <w:rPr>
-          <w:rFonts w:ascii="Times New Roman" w:hAnsi="Times New Roman" w:cs="Times New Roman"/>
-          <w:sz w:val="30"/>
-        </w:rPr>
         <w:tab/>
-      </w:r>
-      <w:proofErr w:type="gramStart"/>
-      <w:r>
-        <w:rPr>
-          <w:rFonts w:ascii="Times New Roman" w:hAnsi="Times New Roman" w:cs="Times New Roman"/>
-          <w:sz w:val="30"/>
-        </w:rPr>
         <w:tab/>
-      </w:r>
-      <w:r>
-        <w:rPr>
-          <w:rFonts w:ascii="Times New Roman" w:hAnsi="Times New Roman" w:cs="Times New Roman"/>
-          <w:sz w:val="30"/>
-        </w:rPr>
-        <w:t xml:space="preserve"> :</w:t>
-      </w:r>
-      <w:proofErr w:type="gramEnd"/>
-      <w:r>
-        <w:rPr>
-          <w:rFonts w:ascii="Times New Roman" w:hAnsi="Times New Roman" w:cs="Times New Roman"/>
-          <w:sz w:val="30"/>
-        </w:rPr>
-        <w:t xml:space="preserve"> </w:t>
-      </w:r>
-      <w:r>
-        <w:rPr>
-          <w:rFonts w:ascii="Times New Roman" w:hAnsi="Times New Roman" w:cs="Times New Roman"/>
-          <w:sz w:val="30"/>
-        </w:rPr>
-        <w:t>srjeevachackomsj@gmail.com</w:t>
-      </w:r>
+        <w:t xml:space="preserve"> : </w:t>
+      </w:r>
+      <w:hyperlink r:id="rId24">
+        <w:r>
+          <w:rPr>
+            <w:color w:val="0000EE"/>
+            <w:u w:val="single"/>
+          </w:rPr>
+          <w:t>srjeevachackomsj@gmail.com</w:t>
+        </w:r>
+      </w:hyperlink>
     </w:p>
     <w:p>
       <w:pPr>
@@ -4310,6 +4169,7 @@
     </w:p>
     <w:p>
       <w:pPr>
+        <w:pageBreakBefore/>
         <w:rPr>
           <w:rFonts w:ascii="Times New Roman" w:hAnsi="Times New Roman" w:cs="Times New Roman"/>
           <w:b/>
@@ -4334,19 +4194,60 @@
       </w:pPr>
     </w:p>
     <w:p>
-      <w:pPr>
-        <w:rPr>
-          <w:rFonts w:ascii="Times New Roman" w:hAnsi="Times New Roman" w:cs="Times New Roman"/>
-          <w:sz w:val="30"/>
-        </w:rPr>
-      </w:pPr>
-      <w:r>
-        <w:rPr>
-          <w:rFonts w:ascii="Times New Roman" w:hAnsi="Times New Roman" w:cs="Times New Roman"/>
-          <w:sz w:val="30"/>
-        </w:rPr>
-        <w:t>Link to the organogram hosted on college website: https://smcp.ac.in/page/organogram</w:t>
-      </w:r>
+      <w:r>
+        <w:drawing>
+          <wp:inline xmlns:a="http://schemas.openxmlformats.org/drawingml/2006/main" xmlns:pic="http://schemas.openxmlformats.org/drawingml/2006/picture">
+            <wp:extent cx="5486400" cy="3881769"/>
+            <wp:docPr id="7" name="Picture 7"/>
+            <wp:cNvGraphicFramePr>
+              <a:graphicFrameLocks noChangeAspect="1"/>
+            </wp:cNvGraphicFramePr>
+            <a:graphic>
+              <a:graphicData uri="http://schemas.openxmlformats.org/drawingml/2006/picture">
+                <pic:pic>
+                  <pic:nvPicPr>
+                    <pic:cNvPr id="0" name="organogram-1.png"/>
+                    <pic:cNvPicPr/>
+                  </pic:nvPicPr>
+                  <pic:blipFill>
+                    <a:blip r:embed="rId20"/>
+                    <a:stretch>
+                      <a:fillRect/>
+                    </a:stretch>
+                  </pic:blipFill>
+                  <pic:spPr>
+                    <a:xfrm>
+                      <a:off x="0" y="0"/>
+                      <a:ext cx="5486400" cy="3881769"/>
+                    </a:xfrm>
+                    <a:prstGeom prst="rect"/>
+                  </pic:spPr>
+                </pic:pic>
+              </a:graphicData>
+            </a:graphic>
+          </wp:inline>
+        </w:drawing>
+      </w:r>
+    </w:p>
+    <w:p>
+      <w:pPr>
+        <w:rPr>
+          <w:rFonts w:ascii="Times New Roman" w:hAnsi="Times New Roman" w:cs="Times New Roman"/>
+          <w:sz w:val="30"/>
+        </w:rPr>
+      </w:pPr>
+      <w:r>
+        <w:t xml:space="preserve">Link to the organogram hosted on college website: </w:t>
+      </w:r>
+      <w:hyperlink r:id="rId15">
+        <w:r>
+          <w:rPr>
+            <w:color w:val="0000EE"/>
+            <w:u w:val="single"/>
+          </w:rPr>
+          <w:t>https://stmaryspanathady.com/organogram.html</w:t>
+        </w:r>
+      </w:hyperlink>
     </w:p>
     <w:p>
       <w:pPr>
@@ -6919,13 +6820,15 @@
           <w:sz w:val="30"/>
         </w:rPr>
       </w:pPr>
-      <w:r>
-        <w:rPr>
-          <w:rFonts w:ascii="Times New Roman" w:hAnsi="Times New Roman" w:cs="Times New Roman"/>
-          <w:sz w:val="30"/>
-        </w:rPr>
-        <w:t>https://smcp.ac.in/page/anti_ragging_squad</w:t>
-      </w:r>
+      <w:hyperlink r:id="rId16">
+        <w:r>
+          <w:rPr>
+            <w:color w:val="0000EE"/>
+            <w:u w:val="single"/>
+          </w:rPr>
+          <w:t>https://stmaryspanathady.com/anti-ragging.html</w:t>
+        </w:r>
+      </w:hyperlink>
     </w:p>
     <w:p>
       <w:pPr>
@@ -7104,13 +7007,15 @@
           <w:sz w:val="30"/>
         </w:rPr>
       </w:pPr>
-      <w:r>
-        <w:rPr>
-          <w:rFonts w:ascii="Times New Roman" w:hAnsi="Times New Roman" w:cs="Times New Roman"/>
-          <w:sz w:val="30"/>
-        </w:rPr>
-        <w:t>https://smcp.ac.in/page/scst</w:t>
-      </w:r>
+      <w:hyperlink r:id="rId17">
+        <w:r>
+          <w:rPr>
+            <w:color w:val="0000EE"/>
+            <w:u w:val="single"/>
+          </w:rPr>
+          <w:t>https://stmaryspanathady.com/sc-st-committee.html</w:t>
+        </w:r>
+      </w:hyperlink>
     </w:p>
     <w:p>
       <w:pPr>
@@ -7262,13 +7167,15 @@
           <w:sz w:val="30"/>
         </w:rPr>
       </w:pPr>
-      <w:r>
-        <w:rPr>
-          <w:rFonts w:ascii="Times New Roman" w:hAnsi="Times New Roman" w:cs="Times New Roman"/>
-          <w:sz w:val="30"/>
-        </w:rPr>
-        <w:t>https://smcp.ac.in/page/iqac</w:t>
-      </w:r>
+      <w:hyperlink r:id="rId18">
+        <w:r>
+          <w:rPr>
+            <w:color w:val="0000EE"/>
+            <w:u w:val="single"/>
+          </w:rPr>
+          <w:t>https://stmaryspanathady.com/iqac.html</w:t>
+        </w:r>
+      </w:hyperlink>
     </w:p>
     <w:p>
       <w:pPr>
@@ -7558,13 +7465,15 @@
           <w:sz w:val="30"/>
         </w:rPr>
       </w:pPr>
-      <w:r>
-        <w:rPr>
-          <w:rFonts w:ascii="Times New Roman" w:hAnsi="Times New Roman" w:cs="Times New Roman"/>
-          <w:sz w:val="30"/>
-        </w:rPr>
-        <w:t>https://smcp.ac.in/page/admission_procedure</w:t>
-      </w:r>
+      <w:hyperlink r:id="rId19">
+        <w:r>
+          <w:rPr>
+            <w:color w:val="0000EE"/>
+            <w:u w:val="single"/>
+          </w:rPr>
+          <w:t>https://stmaryspanathady.com/index.html#contact</w:t>
+        </w:r>
+      </w:hyperlink>
     </w:p>
     <w:p>
       <w:pPr>
@@ -7771,14 +7680,15 @@
           <w:sz w:val="30"/>
         </w:rPr>
       </w:pPr>
-      <w:r>
-        <w:rPr>
-          <w:rFonts w:ascii="Times New Roman" w:hAnsi="Times New Roman" w:cs="Times New Roman"/>
-          <w:b/>
-          <w:sz w:val="30"/>
-        </w:rPr>
-        <w:t>https://smcp.ac.in/page/green_campus</w:t>
-      </w:r>
+      <w:hyperlink r:id="rId8">
+        <w:r>
+          <w:rPr>
+            <w:color w:val="0000EE"/>
+            <w:u w:val="single"/>
+          </w:rPr>
+          <w:t>https://stmaryspanathady.com/infrastructure.html</w:t>
+        </w:r>
+      </w:hyperlink>
     </w:p>
     <w:p>
       <w:pPr>
@@ -8049,14 +7959,13 @@
           <w:sz w:val="30"/>
         </w:rPr>
       </w:pPr>
-      <w:hyperlink r:id="rId8" w:history="1">
+      <w:hyperlink r:id="rId8">
         <w:r>
           <w:rPr>
-            <w:rStyle w:val="Hyperlink"/>
-            <w:rFonts w:ascii="Times New Roman" w:hAnsi="Times New Roman" w:cs="Times New Roman"/>
-            <w:sz w:val="30"/>
+            <w:color w:val="0000EE"/>
+            <w:u w:val="single"/>
           </w:rPr>
-          <w:t>https://smcp.ac.in/page/infrastructure</w:t>
+          <w:t>https://stmaryspanathady.com/infrastructure.html</w:t>
         </w:r>
       </w:hyperlink>
     </w:p>
@@ -11264,29 +11173,18 @@
           <w:sz w:val="30"/>
         </w:rPr>
       </w:pPr>
-      <w:proofErr w:type="gramStart"/>
-      <w:r>
-        <w:rPr>
-          <w:rFonts w:ascii="Times New Roman" w:hAnsi="Times New Roman" w:cs="Times New Roman"/>
-          <w:sz w:val="30"/>
-        </w:rPr>
-        <w:t>Email :</w:t>
-      </w:r>
-      <w:proofErr w:type="gramEnd"/>
-      <w:r>
-        <w:rPr>
-          <w:rFonts w:ascii="Times New Roman" w:hAnsi="Times New Roman" w:cs="Times New Roman"/>
-          <w:sz w:val="30"/>
-        </w:rPr>
-        <w:t xml:space="preserve"> </w:t>
-      </w:r>
-      <w:r>
-        <w:rPr>
-          <w:rFonts w:ascii="Times New Roman" w:hAnsi="Times New Roman" w:cs="Times New Roman"/>
-          <w:sz w:val="30"/>
-        </w:rPr>
-        <w:t>srjeevachackomsj@gmail.com</w:t>
-      </w:r>
+      <w:r>
+        <w:t xml:space="preserve">Email : </w:t>
+      </w:r>
+      <w:hyperlink r:id="rId24">
+        <w:r>
+          <w:rPr>
+            <w:color w:val="0000EE"/>
+            <w:u w:val="single"/>
+          </w:rPr>
+          <w:t>srjeevachackomsj@gmail.com</w:t>
+        </w:r>
+      </w:hyperlink>
     </w:p>
     <w:sectPr>
       <w:pgSz w:w="11906" w:h="16838"/>

</xml_diff>